<commit_message>
Updated test template to new jinja format
</commit_message>
<xml_diff>
--- a/test_data/Template_01.docx
+++ b/test_data/Template_01.docx
@@ -1,6 +1,6 @@
 
 <file path=word/document.xml><?xml version="1.0" encoding="utf-8"?>
-<w:document xmlns:wpc="http://schemas.microsoft.com/office/word/2010/wordprocessingCanvas" xmlns:cx="http://schemas.microsoft.com/office/drawing/2014/chartex" xmlns:cx1="http://schemas.microsoft.com/office/drawing/2015/9/8/chartex" xmlns:cx2="http://schemas.microsoft.com/office/drawing/2015/10/21/chartex" xmlns:cx3="http://schemas.microsoft.com/office/drawing/2016/5/9/chartex" xmlns:cx4="http://schemas.microsoft.com/office/drawing/2016/5/10/chartex" xmlns:cx5="http://schemas.microsoft.com/office/drawing/2016/5/11/chartex" xmlns:cx6="http://schemas.microsoft.com/office/drawing/2016/5/12/chartex" xmlns:cx7="http://schemas.microsoft.com/office/drawing/2016/5/13/chartex" xmlns:cx8="http://schemas.microsoft.com/office/drawing/2016/5/14/chartex" xmlns:mc="http://schemas.openxmlformats.org/markup-compatibility/2006" xmlns:aink="http://schemas.microsoft.com/office/drawing/2016/ink" xmlns:am3d="http://schemas.microsoft.com/office/drawing/2017/model3d" xmlns:o="urn:schemas-microsoft-com:office:office" xmlns:oel="http://schemas.microsoft.com/office/2019/extlst" xmlns:r="http://schemas.openxmlformats.org/officeDocument/2006/relationships" xmlns:m="http://schemas.openxmlformats.org/officeDocument/2006/math" xmlns:v="urn:schemas-microsoft-com:vml" xmlns:wp14="http://schemas.microsoft.com/office/word/2010/wordprocessingDrawing" xmlns:wp="http://schemas.openxmlformats.org/drawingml/2006/wordprocessingDrawing" xmlns:w10="urn:schemas-microsoft-com:office:word" xmlns:w="http://schemas.openxmlformats.org/wordprocessingml/2006/main" xmlns:w14="http://schemas.microsoft.com/office/word/2010/wordml" xmlns:w15="http://schemas.microsoft.com/office/word/2012/wordml" xmlns:w16cex="http://schemas.microsoft.com/office/word/2018/wordml/cex" xmlns:w16cid="http://schemas.microsoft.com/office/word/2016/wordml/cid" xmlns:w16="http://schemas.microsoft.com/office/word/2018/wordml" xmlns:w16du="http://schemas.microsoft.com/office/word/2023/wordml/word16du" xmlns:w16sdtdh="http://schemas.microsoft.com/office/word/2020/wordml/sdtdatahash" xmlns:w16se="http://schemas.microsoft.com/office/word/2015/wordml/symex" xmlns:wpg="http://schemas.microsoft.com/office/word/2010/wordprocessingGroup" xmlns:wpi="http://schemas.microsoft.com/office/word/2010/wordprocessingInk" xmlns:wne="http://schemas.microsoft.com/office/word/2006/wordml" xmlns:wps="http://schemas.microsoft.com/office/word/2010/wordprocessingShape" mc:Ignorable="w14 w15 w16se w16cid w16 w16cex w16sdtdh w16du wp14">
+<w:document xmlns:wpc="http://schemas.microsoft.com/office/word/2010/wordprocessingCanvas" xmlns:cx="http://schemas.microsoft.com/office/drawing/2014/chartex" xmlns:cx1="http://schemas.microsoft.com/office/drawing/2015/9/8/chartex" xmlns:cx2="http://schemas.microsoft.com/office/drawing/2015/10/21/chartex" xmlns:cx3="http://schemas.microsoft.com/office/drawing/2016/5/9/chartex" xmlns:cx4="http://schemas.microsoft.com/office/drawing/2016/5/10/chartex" xmlns:cx5="http://schemas.microsoft.com/office/drawing/2016/5/11/chartex" xmlns:cx6="http://schemas.microsoft.com/office/drawing/2016/5/12/chartex" xmlns:cx7="http://schemas.microsoft.com/office/drawing/2016/5/13/chartex" xmlns:cx8="http://schemas.microsoft.com/office/drawing/2016/5/14/chartex" xmlns:mc="http://schemas.openxmlformats.org/markup-compatibility/2006" xmlns:aink="http://schemas.microsoft.com/office/drawing/2016/ink" xmlns:am3d="http://schemas.microsoft.com/office/drawing/2017/model3d" xmlns:o="urn:schemas-microsoft-com:office:office" xmlns:oel="http://schemas.microsoft.com/office/2019/extlst" xmlns:r="http://schemas.openxmlformats.org/officeDocument/2006/relationships" xmlns:m="http://schemas.openxmlformats.org/officeDocument/2006/math" xmlns:v="urn:schemas-microsoft-com:vml" xmlns:wp14="http://schemas.microsoft.com/office/word/2010/wordprocessingDrawing" xmlns:wp="http://schemas.openxmlformats.org/drawingml/2006/wordprocessingDrawing" xmlns:w10="urn:schemas-microsoft-com:office:word" xmlns:w="http://schemas.openxmlformats.org/wordprocessingml/2006/main" xmlns:w14="http://schemas.microsoft.com/office/word/2010/wordml" xmlns:w15="http://schemas.microsoft.com/office/word/2012/wordml" xmlns:w16cex="http://schemas.microsoft.com/office/word/2018/wordml/cex" xmlns:w16cid="http://schemas.microsoft.com/office/word/2016/wordml/cid" xmlns:w16="http://schemas.microsoft.com/office/word/2018/wordml" xmlns:w16du="http://schemas.microsoft.com/office/word/2023/wordml/word16du" xmlns:w16sdtdh="http://schemas.microsoft.com/office/word/2020/wordml/sdtdatahash" xmlns:w16sdtfl="http://schemas.microsoft.com/office/word/2024/wordml/sdtformatlock" xmlns:w16se="http://schemas.microsoft.com/office/word/2015/wordml/symex" xmlns:wpg="http://schemas.microsoft.com/office/word/2010/wordprocessingGroup" xmlns:wpi="http://schemas.microsoft.com/office/word/2010/wordprocessingInk" xmlns:wne="http://schemas.microsoft.com/office/word/2006/wordml" xmlns:wps="http://schemas.microsoft.com/office/word/2010/wordprocessingShape" mc:Ignorable="w14 w15 w16se w16cid w16 w16cex w16sdtdh w16sdtfl w16du wp14">
   <w:body>
     <w:p>
       <w:proofErr w:type="spellStart"/>
@@ -9,25 +9,13 @@
       </w:r>
       <w:proofErr w:type="spellEnd"/>
       <w:r>
-        <w:t xml:space="preserve"> </w:t>
+        <w:t xml:space="preserve"> {{ </w:t>
       </w:r>
       <w:r>
-        <w:fldChar w:fldCharType="begin"/>
+        <w:t>N</w:t>
       </w:r>
       <w:r>
-        <w:instrText xml:space="preserve"> MERGEFIELD  Name </w:instrText>
-      </w:r>
-      <w:r>
-        <w:fldChar w:fldCharType="separate"/>
-      </w:r>
-      <w:r>
-        <w:rPr>
-          <w:noProof/>
-        </w:rPr>
-        <w:t>«Name»</w:t>
-      </w:r>
-      <w:r>
-        <w:fldChar w:fldCharType="end"/>
+        <w:t>ame }}</w:t>
       </w:r>
       <w:r>
         <w:t xml:space="preserve">, </w:t>
@@ -49,25 +37,18 @@
         <w:t xml:space="preserve"> a </w:t>
       </w:r>
       <w:r>
-        <w:fldChar w:fldCharType="begin"/>
+        <w:t xml:space="preserve">{{ </w:t>
+      </w:r>
+      <w:proofErr w:type="spellStart"/>
+      <w:r>
+        <w:t>N</w:t>
       </w:r>
       <w:r>
-        <w:instrText xml:space="preserve"> MERGEFIELD  Noun </w:instrText>
+        <w:t>oun</w:t>
       </w:r>
+      <w:proofErr w:type="spellEnd"/>
       <w:r>
-        <w:fldChar w:fldCharType="separate"/>
-      </w:r>
-      <w:r>
-        <w:rPr>
-          <w:noProof/>
-        </w:rPr>
-        <w:t>«Noun»</w:t>
-      </w:r>
-      <w:r>
-        <w:fldChar w:fldCharType="end"/>
-      </w:r>
-      <w:r>
-        <w:t xml:space="preserve"> </w:t>
+        <w:t xml:space="preserve"> }}</w:t>
       </w:r>
     </w:p>
     <w:sectPr>
@@ -81,7 +62,7 @@
 </file>
 
 <file path=word/styles.xml><?xml version="1.0" encoding="utf-8"?>
-<w:styles xmlns:mc="http://schemas.openxmlformats.org/markup-compatibility/2006" xmlns:r="http://schemas.openxmlformats.org/officeDocument/2006/relationships" xmlns:w="http://schemas.openxmlformats.org/wordprocessingml/2006/main" xmlns:w14="http://schemas.microsoft.com/office/word/2010/wordml" xmlns:w15="http://schemas.microsoft.com/office/word/2012/wordml" xmlns:w16cex="http://schemas.microsoft.com/office/word/2018/wordml/cex" xmlns:w16cid="http://schemas.microsoft.com/office/word/2016/wordml/cid" xmlns:w16="http://schemas.microsoft.com/office/word/2018/wordml" xmlns:w16du="http://schemas.microsoft.com/office/word/2023/wordml/word16du" xmlns:w16sdtdh="http://schemas.microsoft.com/office/word/2020/wordml/sdtdatahash" xmlns:w16se="http://schemas.microsoft.com/office/word/2015/wordml/symex" mc:Ignorable="w14 w15 w16se w16cid w16 w16cex w16sdtdh w16du">
+<w:styles xmlns:mc="http://schemas.openxmlformats.org/markup-compatibility/2006" xmlns:r="http://schemas.openxmlformats.org/officeDocument/2006/relationships" xmlns:w="http://schemas.openxmlformats.org/wordprocessingml/2006/main" xmlns:w14="http://schemas.microsoft.com/office/word/2010/wordml" xmlns:w15="http://schemas.microsoft.com/office/word/2012/wordml" xmlns:w16cex="http://schemas.microsoft.com/office/word/2018/wordml/cex" xmlns:w16cid="http://schemas.microsoft.com/office/word/2016/wordml/cid" xmlns:w16="http://schemas.microsoft.com/office/word/2018/wordml" xmlns:w16du="http://schemas.microsoft.com/office/word/2023/wordml/word16du" xmlns:w16sdtdh="http://schemas.microsoft.com/office/word/2020/wordml/sdtdatahash" xmlns:w16sdtfl="http://schemas.microsoft.com/office/word/2024/wordml/sdtformatlock" xmlns:w16se="http://schemas.microsoft.com/office/word/2015/wordml/symex" mc:Ignorable="w14 w15 w16se w16cid w16 w16cex w16sdtdh w16sdtfl w16du">
   <w:docDefaults>
     <w:rPrDefault>
       <w:rPr>
@@ -481,11 +462,11 @@
     <w:name w:val="Normal"/>
     <w:qFormat/>
   </w:style>
-  <w:style w:type="paragraph" w:styleId="Heading1">
+  <w:style w:type="paragraph" w:styleId="Overskrift1">
     <w:name w:val="heading 1"/>
     <w:basedOn w:val="Normal"/>
     <w:next w:val="Normal"/>
-    <w:link w:val="Heading1Char"/>
+    <w:link w:val="Overskrift1Tegn"/>
     <w:uiPriority w:val="9"/>
     <w:qFormat/>
     <w:rsid w:val="00CE25FC"/>
@@ -502,11 +483,11 @@
       <w:szCs w:val="40"/>
     </w:rPr>
   </w:style>
-  <w:style w:type="paragraph" w:styleId="Heading2">
+  <w:style w:type="paragraph" w:styleId="Overskrift2">
     <w:name w:val="heading 2"/>
     <w:basedOn w:val="Normal"/>
     <w:next w:val="Normal"/>
-    <w:link w:val="Heading2Char"/>
+    <w:link w:val="Overskrift2Tegn"/>
     <w:uiPriority w:val="9"/>
     <w:semiHidden/>
     <w:unhideWhenUsed/>
@@ -525,11 +506,11 @@
       <w:szCs w:val="32"/>
     </w:rPr>
   </w:style>
-  <w:style w:type="paragraph" w:styleId="Heading3">
+  <w:style w:type="paragraph" w:styleId="Overskrift3">
     <w:name w:val="heading 3"/>
     <w:basedOn w:val="Normal"/>
     <w:next w:val="Normal"/>
-    <w:link w:val="Heading3Char"/>
+    <w:link w:val="Overskrift3Tegn"/>
     <w:uiPriority w:val="9"/>
     <w:semiHidden/>
     <w:unhideWhenUsed/>
@@ -548,11 +529,11 @@
       <w:szCs w:val="28"/>
     </w:rPr>
   </w:style>
-  <w:style w:type="paragraph" w:styleId="Heading4">
+  <w:style w:type="paragraph" w:styleId="Overskrift4">
     <w:name w:val="heading 4"/>
     <w:basedOn w:val="Normal"/>
     <w:next w:val="Normal"/>
-    <w:link w:val="Heading4Char"/>
+    <w:link w:val="Overskrift4Tegn"/>
     <w:uiPriority w:val="9"/>
     <w:semiHidden/>
     <w:unhideWhenUsed/>
@@ -571,11 +552,11 @@
       <w:color w:val="2F5496" w:themeColor="accent1" w:themeShade="BF"/>
     </w:rPr>
   </w:style>
-  <w:style w:type="paragraph" w:styleId="Heading5">
+  <w:style w:type="paragraph" w:styleId="Overskrift5">
     <w:name w:val="heading 5"/>
     <w:basedOn w:val="Normal"/>
     <w:next w:val="Normal"/>
-    <w:link w:val="Heading5Char"/>
+    <w:link w:val="Overskrift5Tegn"/>
     <w:uiPriority w:val="9"/>
     <w:semiHidden/>
     <w:unhideWhenUsed/>
@@ -592,11 +573,11 @@
       <w:color w:val="2F5496" w:themeColor="accent1" w:themeShade="BF"/>
     </w:rPr>
   </w:style>
-  <w:style w:type="paragraph" w:styleId="Heading6">
+  <w:style w:type="paragraph" w:styleId="Overskrift6">
     <w:name w:val="heading 6"/>
     <w:basedOn w:val="Normal"/>
     <w:next w:val="Normal"/>
-    <w:link w:val="Heading6Char"/>
+    <w:link w:val="Overskrift6Tegn"/>
     <w:uiPriority w:val="9"/>
     <w:semiHidden/>
     <w:unhideWhenUsed/>
@@ -615,11 +596,11 @@
       <w:color w:val="595959" w:themeColor="text1" w:themeTint="A6"/>
     </w:rPr>
   </w:style>
-  <w:style w:type="paragraph" w:styleId="Heading7">
+  <w:style w:type="paragraph" w:styleId="Overskrift7">
     <w:name w:val="heading 7"/>
     <w:basedOn w:val="Normal"/>
     <w:next w:val="Normal"/>
-    <w:link w:val="Heading7Char"/>
+    <w:link w:val="Overskrift7Tegn"/>
     <w:uiPriority w:val="9"/>
     <w:semiHidden/>
     <w:unhideWhenUsed/>
@@ -636,11 +617,11 @@
       <w:color w:val="595959" w:themeColor="text1" w:themeTint="A6"/>
     </w:rPr>
   </w:style>
-  <w:style w:type="paragraph" w:styleId="Heading8">
+  <w:style w:type="paragraph" w:styleId="Overskrift8">
     <w:name w:val="heading 8"/>
     <w:basedOn w:val="Normal"/>
     <w:next w:val="Normal"/>
-    <w:link w:val="Heading8Char"/>
+    <w:link w:val="Overskrift8Tegn"/>
     <w:uiPriority w:val="9"/>
     <w:semiHidden/>
     <w:unhideWhenUsed/>
@@ -659,11 +640,11 @@
       <w:color w:val="272727" w:themeColor="text1" w:themeTint="D8"/>
     </w:rPr>
   </w:style>
-  <w:style w:type="paragraph" w:styleId="Heading9">
+  <w:style w:type="paragraph" w:styleId="Overskrift9">
     <w:name w:val="heading 9"/>
     <w:basedOn w:val="Normal"/>
     <w:next w:val="Normal"/>
-    <w:link w:val="Heading9Char"/>
+    <w:link w:val="Overskrift9Tegn"/>
     <w:uiPriority w:val="9"/>
     <w:semiHidden/>
     <w:unhideWhenUsed/>
@@ -680,13 +661,13 @@
       <w:color w:val="272727" w:themeColor="text1" w:themeTint="D8"/>
     </w:rPr>
   </w:style>
-  <w:style w:type="character" w:default="1" w:styleId="DefaultParagraphFont">
+  <w:style w:type="character" w:default="1" w:styleId="Standardskrifttypeiafsnit">
     <w:name w:val="Default Paragraph Font"/>
     <w:uiPriority w:val="1"/>
     <w:semiHidden/>
     <w:unhideWhenUsed/>
   </w:style>
-  <w:style w:type="table" w:default="1" w:styleId="TableNormal">
+  <w:style w:type="table" w:default="1" w:styleId="Tabel-Normal">
     <w:name w:val="Normal Table"/>
     <w:uiPriority w:val="99"/>
     <w:semiHidden/>
@@ -701,16 +682,16 @@
       </w:tblCellMar>
     </w:tblPr>
   </w:style>
-  <w:style w:type="numbering" w:default="1" w:styleId="NoList">
+  <w:style w:type="numbering" w:default="1" w:styleId="Ingenoversigt">
     <w:name w:val="No List"/>
     <w:uiPriority w:val="99"/>
     <w:semiHidden/>
     <w:unhideWhenUsed/>
   </w:style>
-  <w:style w:type="character" w:customStyle="1" w:styleId="Heading1Char">
-    <w:name w:val="Heading 1 Char"/>
-    <w:basedOn w:val="DefaultParagraphFont"/>
-    <w:link w:val="Heading1"/>
+  <w:style w:type="character" w:customStyle="1" w:styleId="Overskrift1Tegn">
+    <w:name w:val="Overskrift 1 Tegn"/>
+    <w:basedOn w:val="Standardskrifttypeiafsnit"/>
+    <w:link w:val="Overskrift1"/>
     <w:uiPriority w:val="9"/>
     <w:rsid w:val="00CE25FC"/>
     <w:rPr>
@@ -720,10 +701,10 @@
       <w:szCs w:val="40"/>
     </w:rPr>
   </w:style>
-  <w:style w:type="character" w:customStyle="1" w:styleId="Heading2Char">
-    <w:name w:val="Heading 2 Char"/>
-    <w:basedOn w:val="DefaultParagraphFont"/>
-    <w:link w:val="Heading2"/>
+  <w:style w:type="character" w:customStyle="1" w:styleId="Overskrift2Tegn">
+    <w:name w:val="Overskrift 2 Tegn"/>
+    <w:basedOn w:val="Standardskrifttypeiafsnit"/>
+    <w:link w:val="Overskrift2"/>
     <w:uiPriority w:val="9"/>
     <w:semiHidden/>
     <w:rsid w:val="00CE25FC"/>
@@ -734,10 +715,10 @@
       <w:szCs w:val="32"/>
     </w:rPr>
   </w:style>
-  <w:style w:type="character" w:customStyle="1" w:styleId="Heading3Char">
-    <w:name w:val="Heading 3 Char"/>
-    <w:basedOn w:val="DefaultParagraphFont"/>
-    <w:link w:val="Heading3"/>
+  <w:style w:type="character" w:customStyle="1" w:styleId="Overskrift3Tegn">
+    <w:name w:val="Overskrift 3 Tegn"/>
+    <w:basedOn w:val="Standardskrifttypeiafsnit"/>
+    <w:link w:val="Overskrift3"/>
     <w:uiPriority w:val="9"/>
     <w:semiHidden/>
     <w:rsid w:val="00CE25FC"/>
@@ -748,10 +729,10 @@
       <w:szCs w:val="28"/>
     </w:rPr>
   </w:style>
-  <w:style w:type="character" w:customStyle="1" w:styleId="Heading4Char">
-    <w:name w:val="Heading 4 Char"/>
-    <w:basedOn w:val="DefaultParagraphFont"/>
-    <w:link w:val="Heading4"/>
+  <w:style w:type="character" w:customStyle="1" w:styleId="Overskrift4Tegn">
+    <w:name w:val="Overskrift 4 Tegn"/>
+    <w:basedOn w:val="Standardskrifttypeiafsnit"/>
+    <w:link w:val="Overskrift4"/>
     <w:uiPriority w:val="9"/>
     <w:semiHidden/>
     <w:rsid w:val="00CE25FC"/>
@@ -762,22 +743,22 @@
       <w:color w:val="2F5496" w:themeColor="accent1" w:themeShade="BF"/>
     </w:rPr>
   </w:style>
-  <w:style w:type="character" w:customStyle="1" w:styleId="Heading5Char">
-    <w:name w:val="Heading 5 Char"/>
-    <w:basedOn w:val="DefaultParagraphFont"/>
-    <w:link w:val="Heading5"/>
-    <w:uiPriority w:val="9"/>
-    <w:semiHidden/>
-    <w:rsid w:val="00CE25FC"/>
-    <w:rPr>
-      <w:rFonts w:eastAsiaTheme="majorEastAsia" w:cstheme="majorBidi"/>
-      <w:color w:val="2F5496" w:themeColor="accent1" w:themeShade="BF"/>
-    </w:rPr>
-  </w:style>
-  <w:style w:type="character" w:customStyle="1" w:styleId="Heading6Char">
-    <w:name w:val="Heading 6 Char"/>
-    <w:basedOn w:val="DefaultParagraphFont"/>
-    <w:link w:val="Heading6"/>
+  <w:style w:type="character" w:customStyle="1" w:styleId="Overskrift5Tegn">
+    <w:name w:val="Overskrift 5 Tegn"/>
+    <w:basedOn w:val="Standardskrifttypeiafsnit"/>
+    <w:link w:val="Overskrift5"/>
+    <w:uiPriority w:val="9"/>
+    <w:semiHidden/>
+    <w:rsid w:val="00CE25FC"/>
+    <w:rPr>
+      <w:rFonts w:eastAsiaTheme="majorEastAsia" w:cstheme="majorBidi"/>
+      <w:color w:val="2F5496" w:themeColor="accent1" w:themeShade="BF"/>
+    </w:rPr>
+  </w:style>
+  <w:style w:type="character" w:customStyle="1" w:styleId="Overskrift6Tegn">
+    <w:name w:val="Overskrift 6 Tegn"/>
+    <w:basedOn w:val="Standardskrifttypeiafsnit"/>
+    <w:link w:val="Overskrift6"/>
     <w:uiPriority w:val="9"/>
     <w:semiHidden/>
     <w:rsid w:val="00CE25FC"/>
@@ -788,10 +769,10 @@
       <w:color w:val="595959" w:themeColor="text1" w:themeTint="A6"/>
     </w:rPr>
   </w:style>
-  <w:style w:type="character" w:customStyle="1" w:styleId="Heading7Char">
-    <w:name w:val="Heading 7 Char"/>
-    <w:basedOn w:val="DefaultParagraphFont"/>
-    <w:link w:val="Heading7"/>
+  <w:style w:type="character" w:customStyle="1" w:styleId="Overskrift7Tegn">
+    <w:name w:val="Overskrift 7 Tegn"/>
+    <w:basedOn w:val="Standardskrifttypeiafsnit"/>
+    <w:link w:val="Overskrift7"/>
     <w:uiPriority w:val="9"/>
     <w:semiHidden/>
     <w:rsid w:val="00CE25FC"/>
@@ -800,10 +781,10 @@
       <w:color w:val="595959" w:themeColor="text1" w:themeTint="A6"/>
     </w:rPr>
   </w:style>
-  <w:style w:type="character" w:customStyle="1" w:styleId="Heading8Char">
-    <w:name w:val="Heading 8 Char"/>
-    <w:basedOn w:val="DefaultParagraphFont"/>
-    <w:link w:val="Heading8"/>
+  <w:style w:type="character" w:customStyle="1" w:styleId="Overskrift8Tegn">
+    <w:name w:val="Overskrift 8 Tegn"/>
+    <w:basedOn w:val="Standardskrifttypeiafsnit"/>
+    <w:link w:val="Overskrift8"/>
     <w:uiPriority w:val="9"/>
     <w:semiHidden/>
     <w:rsid w:val="00CE25FC"/>
@@ -814,10 +795,10 @@
       <w:color w:val="272727" w:themeColor="text1" w:themeTint="D8"/>
     </w:rPr>
   </w:style>
-  <w:style w:type="character" w:customStyle="1" w:styleId="Heading9Char">
-    <w:name w:val="Heading 9 Char"/>
-    <w:basedOn w:val="DefaultParagraphFont"/>
-    <w:link w:val="Heading9"/>
+  <w:style w:type="character" w:customStyle="1" w:styleId="Overskrift9Tegn">
+    <w:name w:val="Overskrift 9 Tegn"/>
+    <w:basedOn w:val="Standardskrifttypeiafsnit"/>
+    <w:link w:val="Overskrift9"/>
     <w:uiPriority w:val="9"/>
     <w:semiHidden/>
     <w:rsid w:val="00CE25FC"/>
@@ -826,11 +807,11 @@
       <w:color w:val="272727" w:themeColor="text1" w:themeTint="D8"/>
     </w:rPr>
   </w:style>
-  <w:style w:type="paragraph" w:styleId="Title">
+  <w:style w:type="paragraph" w:styleId="Titel">
     <w:name w:val="Title"/>
     <w:basedOn w:val="Normal"/>
     <w:next w:val="Normal"/>
-    <w:link w:val="TitleChar"/>
+    <w:link w:val="TitelTegn"/>
     <w:uiPriority w:val="10"/>
     <w:qFormat/>
     <w:rsid w:val="00CE25FC"/>
@@ -846,10 +827,10 @@
       <w:szCs w:val="56"/>
     </w:rPr>
   </w:style>
-  <w:style w:type="character" w:customStyle="1" w:styleId="TitleChar">
-    <w:name w:val="Title Char"/>
-    <w:basedOn w:val="DefaultParagraphFont"/>
-    <w:link w:val="Title"/>
+  <w:style w:type="character" w:customStyle="1" w:styleId="TitelTegn">
+    <w:name w:val="Titel Tegn"/>
+    <w:basedOn w:val="Standardskrifttypeiafsnit"/>
+    <w:link w:val="Titel"/>
     <w:uiPriority w:val="10"/>
     <w:rsid w:val="00CE25FC"/>
     <w:rPr>
@@ -860,11 +841,11 @@
       <w:szCs w:val="56"/>
     </w:rPr>
   </w:style>
-  <w:style w:type="paragraph" w:styleId="Subtitle">
+  <w:style w:type="paragraph" w:styleId="Undertitel">
     <w:name w:val="Subtitle"/>
     <w:basedOn w:val="Normal"/>
     <w:next w:val="Normal"/>
-    <w:link w:val="SubtitleChar"/>
+    <w:link w:val="UndertitelTegn"/>
     <w:uiPriority w:val="11"/>
     <w:qFormat/>
     <w:rsid w:val="00CE25FC"/>
@@ -881,10 +862,10 @@
       <w:szCs w:val="28"/>
     </w:rPr>
   </w:style>
-  <w:style w:type="character" w:customStyle="1" w:styleId="SubtitleChar">
-    <w:name w:val="Subtitle Char"/>
-    <w:basedOn w:val="DefaultParagraphFont"/>
-    <w:link w:val="Subtitle"/>
+  <w:style w:type="character" w:customStyle="1" w:styleId="UndertitelTegn">
+    <w:name w:val="Undertitel Tegn"/>
+    <w:basedOn w:val="Standardskrifttypeiafsnit"/>
+    <w:link w:val="Undertitel"/>
     <w:uiPriority w:val="11"/>
     <w:rsid w:val="00CE25FC"/>
     <w:rPr>
@@ -895,11 +876,11 @@
       <w:szCs w:val="28"/>
     </w:rPr>
   </w:style>
-  <w:style w:type="paragraph" w:styleId="Quote">
+  <w:style w:type="paragraph" w:styleId="Citat">
     <w:name w:val="Quote"/>
     <w:basedOn w:val="Normal"/>
     <w:next w:val="Normal"/>
-    <w:link w:val="QuoteChar"/>
+    <w:link w:val="CitatTegn"/>
     <w:uiPriority w:val="29"/>
     <w:qFormat/>
     <w:rsid w:val="00CE25FC"/>
@@ -913,10 +894,10 @@
       <w:color w:val="404040" w:themeColor="text1" w:themeTint="BF"/>
     </w:rPr>
   </w:style>
-  <w:style w:type="character" w:customStyle="1" w:styleId="QuoteChar">
-    <w:name w:val="Quote Char"/>
-    <w:basedOn w:val="DefaultParagraphFont"/>
-    <w:link w:val="Quote"/>
+  <w:style w:type="character" w:customStyle="1" w:styleId="CitatTegn">
+    <w:name w:val="Citat Tegn"/>
+    <w:basedOn w:val="Standardskrifttypeiafsnit"/>
+    <w:link w:val="Citat"/>
     <w:uiPriority w:val="29"/>
     <w:rsid w:val="00CE25FC"/>
     <w:rPr>
@@ -925,7 +906,7 @@
       <w:color w:val="404040" w:themeColor="text1" w:themeTint="BF"/>
     </w:rPr>
   </w:style>
-  <w:style w:type="paragraph" w:styleId="ListParagraph">
+  <w:style w:type="paragraph" w:styleId="Listeafsnit">
     <w:name w:val="List Paragraph"/>
     <w:basedOn w:val="Normal"/>
     <w:uiPriority w:val="34"/>
@@ -936,9 +917,9 @@
       <w:contextualSpacing/>
     </w:pPr>
   </w:style>
-  <w:style w:type="character" w:styleId="IntenseEmphasis">
+  <w:style w:type="character" w:styleId="Kraftigfremhvning">
     <w:name w:val="Intense Emphasis"/>
-    <w:basedOn w:val="DefaultParagraphFont"/>
+    <w:basedOn w:val="Standardskrifttypeiafsnit"/>
     <w:uiPriority w:val="21"/>
     <w:qFormat/>
     <w:rsid w:val="00CE25FC"/>
@@ -948,11 +929,11 @@
       <w:color w:val="2F5496" w:themeColor="accent1" w:themeShade="BF"/>
     </w:rPr>
   </w:style>
-  <w:style w:type="paragraph" w:styleId="IntenseQuote">
+  <w:style w:type="paragraph" w:styleId="Strktcitat">
     <w:name w:val="Intense Quote"/>
     <w:basedOn w:val="Normal"/>
     <w:next w:val="Normal"/>
-    <w:link w:val="IntenseQuoteChar"/>
+    <w:link w:val="StrktcitatTegn"/>
     <w:uiPriority w:val="30"/>
     <w:qFormat/>
     <w:rsid w:val="00CE25FC"/>
@@ -971,10 +952,10 @@
       <w:color w:val="2F5496" w:themeColor="accent1" w:themeShade="BF"/>
     </w:rPr>
   </w:style>
-  <w:style w:type="character" w:customStyle="1" w:styleId="IntenseQuoteChar">
-    <w:name w:val="Intense Quote Char"/>
-    <w:basedOn w:val="DefaultParagraphFont"/>
-    <w:link w:val="IntenseQuote"/>
+  <w:style w:type="character" w:customStyle="1" w:styleId="StrktcitatTegn">
+    <w:name w:val="Stærkt citat Tegn"/>
+    <w:basedOn w:val="Standardskrifttypeiafsnit"/>
+    <w:link w:val="Strktcitat"/>
     <w:uiPriority w:val="30"/>
     <w:rsid w:val="00CE25FC"/>
     <w:rPr>
@@ -983,9 +964,9 @@
       <w:color w:val="2F5496" w:themeColor="accent1" w:themeShade="BF"/>
     </w:rPr>
   </w:style>
-  <w:style w:type="character" w:styleId="IntenseReference">
+  <w:style w:type="character" w:styleId="Kraftighenvisning">
     <w:name w:val="Intense Reference"/>
-    <w:basedOn w:val="DefaultParagraphFont"/>
+    <w:basedOn w:val="Standardskrifttypeiafsnit"/>
     <w:uiPriority w:val="32"/>
     <w:qFormat/>
     <w:rsid w:val="00CE25FC"/>

</xml_diff>